<commit_message>
Twilight forest art: duskbloom, duskbell (day/night), oak (summer/winter), fern; snow in the fog for the north; mirror tree prompt
Co-Authored-By: Claude Opus 5.5 <noreply@anthropic.com>
Claude-Session: https://claude.ai/code/session_01YCWNLtj9zFsogxZeNiDKcG
</commit_message>
<xml_diff>
--- a/Промпты-Сумеречный-лес.docx
+++ b/Промпты-Сумеречный-лес.docx
@@ -147,6 +147,35 @@
       </w:pPr>
       <w:r>
         <w:t>Three variants of one reed clump for RimWorld on one sheet, side by side with space between them, seen in the RimWorld top-down 3/4 view, transparent background: a dense clump of tall slender reeds and cattails, grey-green stems with dark velvety brown seed heads, a few long leaves bending over; each variant slightly different. Painterly RimWorld plant style, a thin dark outline. 1536x512.</w:t>
+      </w:r>
+    </w:p>
+    <w:p>
+      <w:pPr>
+        <w:pStyle w:val="Heading2"/>
+      </w:pPr>
+      <w:r>
+        <w:t>Зеркальное древо — экзотика Сумеречного Леса</w:t>
+      </w:r>
+    </w:p>
+    <w:p>
+      <w:r>
+        <w:t>Файлы: Avir_TreeMirror_A/B/C. Зимой не облетает, поэтому безлистного листа не нужно; по желанию — зимний вариант с инеем, файлы Avir_TreeMirror_Winter_A/B/C.</w:t>
+      </w:r>
+    </w:p>
+    <w:p>
+      <w:pPr>
+        <w:pStyle w:val="IntenseQuote"/>
+      </w:pPr>
+      <w:r>
+        <w:t>Three variants of one exotic tree for RimWorld on one sheet, side by side with space between them, seen in the RimWorld top-down 3/4 view, transparent background: a slender graceful tree whose smooth trunk and branches look like polished silver-grey mirror, reflecting faint streaks of the dusky sky in cool violet and pale blue highlights; the crown is airy and open, made of thin dark branches covered with countless small glittering buds like tiny crystal beads catching the light, with a few narrow dark leaves between them; at its foot a few smooth mirror-like roots. Painterly RimWorld plant style, a thin dark outline. 1536x512.</w:t>
+      </w:r>
+    </w:p>
+    <w:p>
+      <w:pPr>
+        <w:pStyle w:val="IntenseQuote"/>
+      </w:pPr>
+      <w:r>
+        <w:t>The same three mirror trees in winter: the mirror trunks and branches dusted with frost and a little snow on the upper boughs, the glittering crystal buds still on the branches and sparkling brighter in the cold, the narrow leaves gone. Same view, layout and style: RimWorld top-down 3/4 view, transparent background, a thin dark outline. 1536x512.</w:t>
       </w:r>
     </w:p>
     <w:sectPr>

</xml_diff>

<commit_message>
Twilight forest: reed and mirror tree art; terrain/water prompts in the book's brighter palette; Alleanor in the lore; palette comparison
Co-Authored-By: Claude Opus 5.5 <noreply@anthropic.com>
Claude-Session: https://claude.ai/code/session_01YCWNLtj9zFsogxZeNiDKcG
</commit_message>
<xml_diff>
--- a/Промпты-Сумеречный-лес.docx
+++ b/Промпты-Сумеречный-лес.docx
@@ -176,6 +176,85 @@
       </w:pPr>
       <w:r>
         <w:t>The same three mirror trees in winter: the mirror trunks and branches dusted with frost and a little snow on the upper boughs, the glittering crystal buds still on the branches and sparkling brighter in the cold, the narrow leaves gone. Same view, layout and style: RimWorld top-down 3/4 view, transparent background, a thin dark outline. 1536x512.</w:t>
+      </w:r>
+    </w:p>
+    <w:p>
+      <w:pPr>
+        <w:pStyle w:val="Heading2"/>
+      </w:pPr>
+      <w:r>
+        <w:t>Палитра региона (для всех следующих промптов)</w:t>
+      </w:r>
+    </w:p>
+    <w:p>
+      <w:r>
+        <w:t>По книге Аллеанор — «Блистающий Лес»: изумрудный, ласковый, полный света — вечернее рыже-золотое солнце сквозь листву, а в темноте тысячи огней духов и цветов (охра, голубой, янтарь, лазурь, рубин). Поэтому дальше в промптах не «сумрачно-серо-лиловое», а: сочная изумрудная зелень, тёплые золотые блики, мягкие цветные огоньки. Уже нарисованный арт я могу осветлить сам (см. сравнение).</w:t>
+      </w:r>
+    </w:p>
+    <w:p>
+      <w:pPr>
+        <w:pStyle w:val="Heading2"/>
+      </w:pPr>
+      <w:r>
+        <w:t>Земля Сумеречного Леса</w:t>
+      </w:r>
+    </w:p>
+    <w:p>
+      <w:r>
+        <w:t>Это земля, а не предметы: без тёмной каймы, бесшовные плитки 1024x1024, вид строго сверху, без падающих теней. Файлы: Textures/Terrain/Surfaces/Avir_TwilightSoil.png, Avir_TwilightSoilRich.png, Avir_TwilightSoilStony.png.</w:t>
+      </w:r>
+    </w:p>
+    <w:p>
+      <w:pPr>
+        <w:pStyle w:val="IntenseQuote"/>
+      </w:pPr>
+      <w:r>
+        <w:t>A seamless tileable top-down ground texture for RimWorld, seen straight from above: soft forest soil of warm brown loam, scattered with tiny patches of bright emerald moss, small clover-like leaves and a few fallen leaves in green and gold; lively and gentle, not grey; even soft light, no cast shadows, no large features, no outline; the pattern spread evenly so it tiles without visible seams. Painterly RimWorld terrain style. 1024x1024.</w:t>
+      </w:r>
+    </w:p>
+    <w:p>
+      <w:pPr>
+        <w:pStyle w:val="IntenseQuote"/>
+      </w:pPr>
+      <w:r>
+        <w:t>A seamless tileable top-down ground texture for RimWorld, seen straight from above: rich dark fertile forest soil, moist and crumbly, deep brown-black with a warm undertone, threaded with fine pale roots, dotted with bright emerald moss and small sprouts and a little golden leaf litter; even soft light, no cast shadows, no large features, no outline; the pattern spread evenly so it tiles without visible seams. Painterly RimWorld terrain style. 1024x1024.</w:t>
+      </w:r>
+    </w:p>
+    <w:p>
+      <w:pPr>
+        <w:pStyle w:val="IntenseQuote"/>
+      </w:pPr>
+      <w:r>
+        <w:t>A seamless tileable top-down ground texture for RimWorld, seen straight from above: slightly stony forest soil - warm brown loam with many small rounded pebbles in grey, cream and soft ochre, a few flat stones patched with pale green and gold lichen, tufts of emerald moss between them; even soft light, no cast shadows, no large rocks, no outline; the pattern spread evenly so it tiles without visible seams. Painterly RimWorld terrain style. 1024x1024.</w:t>
+      </w:r>
+    </w:p>
+    <w:p>
+      <w:pPr>
+        <w:pStyle w:val="Heading2"/>
+      </w:pPr>
+      <w:r>
+        <w:t>Вода Сумеречного Леса (по желанию)</w:t>
+      </w:r>
+    </w:p>
+    <w:p>
+      <w:r>
+        <w:t>Свою воду сделать можно: это та же ванильная вода (мелкая и глубокая), но со своей текстурой и цветом. Если арта не будет, я просто подкрашу ванильную воду в изумрудно-бирюзовый. Файлы: Avir_TwilightWaterShallow.png, Avir_TwilightWaterDeep.png.</w:t>
+      </w:r>
+    </w:p>
+    <w:p>
+      <w:pPr>
+        <w:pStyle w:val="IntenseQuote"/>
+      </w:pPr>
+      <w:r>
+        <w:t>A seamless tileable top-down water texture for RimWorld, seen straight from above: clear shallow forest pond water with an emerald-teal tint, the sandy-brown bottom with pebbles and a few fallen leaves faintly visible through it, soft ripples, small scattered glints of golden light on the surface; even, no outline; tiles without visible seams. Painterly RimWorld terrain style. 1024x1024.</w:t>
+      </w:r>
+    </w:p>
+    <w:p>
+      <w:pPr>
+        <w:pStyle w:val="IntenseQuote"/>
+      </w:pPr>
+      <w:r>
+        <w:t>A seamless tileable top-down water texture for RimWorld, seen straight from above: deep forest pond water, dark emerald to deep teal, the bottom no longer visible, soft slow ripples, a few faint glints of golden light; even, no outline; tiles without visible seams. Painterly RimWorld terrain style. 1024x1024.</w:t>
       </w:r>
     </w:p>
     <w:sectPr>

</xml_diff>